<commit_message>
fixed monthly monitoring report
</commit_message>
<xml_diff>
--- a/report_template/monitoring_temp.docx
+++ b/report_template/monitoring_temp.docx
@@ -526,81 +526,48 @@
       <w:pPr>
         <w:keepNext/>
         <w:spacing w:after="0" w:line="240" w:lineRule="auto"/>
-        <w:jc w:val="both"/>
-        <w:rPr>
-          <w:rFonts w:ascii="Arial" w:eastAsia="Arial" w:hAnsi="Arial" w:cs="Arial"/>
-          <w:b/>
-          <w:bCs/>
-          <w:sz w:val="22"/>
-          <w:szCs w:val="22"/>
+        <w:jc w:val="center"/>
+        <w:rPr>
+          <w:rFonts w:ascii="Times New Roman" w:eastAsia="Times New Roman" w:hAnsi="Times New Roman" w:cs="Times New Roman"/>
+          <w:b/>
+          <w:bCs/>
         </w:rPr>
       </w:pPr>
     </w:p>
     <w:tbl>
       <w:tblPr>
-        <w:tblStyle w:val="a"/>
-        <w:tblW w:w="17505" w:type="dxa"/>
-        <w:tblInd w:w="0" w:type="dxa"/>
-        <w:tblBorders>
-          <w:top w:val="nil"/>
-          <w:left w:val="nil"/>
-          <w:bottom w:val="nil"/>
-          <w:right w:val="nil"/>
-          <w:insideH w:val="nil"/>
-          <w:insideV w:val="nil"/>
-        </w:tblBorders>
-        <w:tblLayout w:type="fixed"/>
-        <w:tblLook w:val="0600" w:firstRow="0" w:lastRow="0" w:firstColumn="0" w:lastColumn="0" w:noHBand="1" w:noVBand="1"/>
+        <w:tblStyle w:val="TableGrid"/>
+        <w:tblW w:w="0" w:type="auto"/>
+        <w:tblLook w:val="04A0" w:firstRow="1" w:lastRow="0" w:firstColumn="1" w:lastColumn="0" w:noHBand="0" w:noVBand="1"/>
       </w:tblPr>
       <w:tblGrid>
-        <w:gridCol w:w="3375"/>
-        <w:gridCol w:w="6180"/>
-        <w:gridCol w:w="2625"/>
-        <w:gridCol w:w="3240"/>
-        <w:gridCol w:w="2085"/>
+        <w:gridCol w:w="3742"/>
+        <w:gridCol w:w="3742"/>
+        <w:gridCol w:w="3742"/>
+        <w:gridCol w:w="3742"/>
+        <w:gridCol w:w="3742"/>
       </w:tblGrid>
       <w:tr>
-        <w:trPr>
-          <w:trHeight w:val="720"/>
-        </w:trPr>
         <w:tc>
           <w:tcPr>
-            <w:tcW w:w="3375" w:type="dxa"/>
-            <w:tcBorders>
-              <w:top w:val="single" w:sz="6" w:space="0" w:color="000000"/>
-              <w:left w:val="single" w:sz="6" w:space="0" w:color="000000"/>
-              <w:bottom w:val="single" w:sz="6" w:space="0" w:color="000000"/>
-              <w:right w:val="single" w:sz="6" w:space="0" w:color="000000"/>
-            </w:tcBorders>
-            <w:tcMar>
-              <w:top w:w="0" w:type="dxa"/>
-              <w:left w:w="0" w:type="dxa"/>
-              <w:bottom w:w="0" w:type="dxa"/>
-              <w:right w:w="0" w:type="dxa"/>
-            </w:tcMar>
+            <w:tcW w:w="3742" w:type="dxa"/>
             <w:vAlign w:val="center"/>
           </w:tcPr>
           <w:p>
             <w:pPr>
               <w:keepNext/>
-              <w:keepLines/>
-              <w:spacing w:after="0" w:line="240" w:lineRule="auto"/>
               <w:jc w:val="center"/>
               <w:rPr>
-                <w:rFonts w:ascii="Arial" w:eastAsia="Arial" w:hAnsi="Arial" w:cs="Arial"/>
-                <w:b/>
-                <w:bCs/>
-                <w:sz w:val="20"/>
-                <w:szCs w:val="20"/>
+                <w:rFonts w:ascii="Arial" w:eastAsia="Times New Roman" w:hAnsi="Arial" w:cs="Arial"/>
+                <w:b/>
+                <w:bCs/>
               </w:rPr>
             </w:pPr>
             <w:r>
               <w:rPr>
-                <w:rFonts w:ascii="Arial" w:eastAsia="Arial" w:hAnsi="Arial" w:cs="Arial"/>
-                <w:b/>
-                <w:bCs/>
-                <w:sz w:val="20"/>
-                <w:szCs w:val="20"/>
+                <w:rFonts w:ascii="Arial" w:eastAsia="Times New Roman" w:hAnsi="Arial" w:cs="Arial"/>
+                <w:b/>
+                <w:bCs/>
               </w:rPr>
               <w:t>Type of Vehicle</w:t>
             </w:r>
@@ -608,42 +575,24 @@
         </w:tc>
         <w:tc>
           <w:tcPr>
-            <w:tcW w:w="6180" w:type="dxa"/>
-            <w:tcBorders>
-              <w:top w:val="single" w:sz="6" w:space="0" w:color="000000"/>
-              <w:left w:val="nil"/>
-              <w:bottom w:val="single" w:sz="6" w:space="0" w:color="000000"/>
-              <w:right w:val="single" w:sz="6" w:space="0" w:color="000000"/>
-            </w:tcBorders>
-            <w:tcMar>
-              <w:top w:w="0" w:type="dxa"/>
-              <w:left w:w="0" w:type="dxa"/>
-              <w:bottom w:w="0" w:type="dxa"/>
-              <w:right w:w="0" w:type="dxa"/>
-            </w:tcMar>
+            <w:tcW w:w="3742" w:type="dxa"/>
             <w:vAlign w:val="center"/>
           </w:tcPr>
           <w:p>
             <w:pPr>
               <w:keepNext/>
-              <w:keepLines/>
-              <w:spacing w:after="0" w:line="240" w:lineRule="auto"/>
               <w:jc w:val="center"/>
               <w:rPr>
-                <w:rFonts w:ascii="Arial" w:eastAsia="Arial" w:hAnsi="Arial" w:cs="Arial"/>
-                <w:b/>
-                <w:bCs/>
-                <w:sz w:val="20"/>
-                <w:szCs w:val="20"/>
+                <w:rFonts w:ascii="Arial" w:eastAsia="Times New Roman" w:hAnsi="Arial" w:cs="Arial"/>
+                <w:b/>
+                <w:bCs/>
               </w:rPr>
             </w:pPr>
             <w:r>
               <w:rPr>
-                <w:rFonts w:ascii="Arial" w:eastAsia="Arial" w:hAnsi="Arial" w:cs="Arial"/>
-                <w:b/>
-                <w:bCs/>
-                <w:sz w:val="20"/>
-                <w:szCs w:val="20"/>
+                <w:rFonts w:ascii="Arial" w:eastAsia="Times New Roman" w:hAnsi="Arial" w:cs="Arial"/>
+                <w:b/>
+                <w:bCs/>
               </w:rPr>
               <w:t>Details</w:t>
             </w:r>
@@ -651,85 +600,49 @@
         </w:tc>
         <w:tc>
           <w:tcPr>
-            <w:tcW w:w="2625" w:type="dxa"/>
-            <w:tcBorders>
-              <w:top w:val="single" w:sz="6" w:space="0" w:color="000000"/>
-              <w:left w:val="nil"/>
-              <w:bottom w:val="single" w:sz="6" w:space="0" w:color="000000"/>
-              <w:right w:val="single" w:sz="6" w:space="0" w:color="000000"/>
-            </w:tcBorders>
-            <w:tcMar>
-              <w:top w:w="0" w:type="dxa"/>
-              <w:left w:w="0" w:type="dxa"/>
-              <w:bottom w:w="0" w:type="dxa"/>
-              <w:right w:w="0" w:type="dxa"/>
-            </w:tcMar>
+            <w:tcW w:w="3742" w:type="dxa"/>
             <w:vAlign w:val="center"/>
           </w:tcPr>
           <w:p>
             <w:pPr>
               <w:keepNext/>
-              <w:keepLines/>
-              <w:spacing w:after="0" w:line="240" w:lineRule="auto"/>
               <w:jc w:val="center"/>
               <w:rPr>
-                <w:rFonts w:ascii="Arial" w:eastAsia="Arial" w:hAnsi="Arial" w:cs="Arial"/>
-                <w:b/>
-                <w:bCs/>
-                <w:sz w:val="20"/>
-                <w:szCs w:val="20"/>
+                <w:rFonts w:ascii="Arial" w:eastAsia="Times New Roman" w:hAnsi="Arial" w:cs="Arial"/>
+                <w:b/>
+                <w:bCs/>
               </w:rPr>
             </w:pPr>
             <w:r>
               <w:rPr>
-                <w:rFonts w:ascii="Arial" w:eastAsia="Arial" w:hAnsi="Arial" w:cs="Arial"/>
-                <w:b/>
-                <w:bCs/>
-                <w:sz w:val="20"/>
-                <w:szCs w:val="20"/>
-              </w:rPr>
-              <w:t>Schedule Date for Preventive Maintenance</w:t>
+                <w:rFonts w:ascii="Arial" w:eastAsia="Times New Roman" w:hAnsi="Arial" w:cs="Arial"/>
+                <w:b/>
+                <w:bCs/>
+              </w:rPr>
+              <w:t>Schedule for Preventive Maintenance</w:t>
             </w:r>
           </w:p>
         </w:tc>
         <w:tc>
           <w:tcPr>
-            <w:tcW w:w="3240" w:type="dxa"/>
-            <w:tcBorders>
-              <w:top w:val="single" w:sz="6" w:space="0" w:color="000000"/>
-              <w:left w:val="nil"/>
-              <w:bottom w:val="single" w:sz="6" w:space="0" w:color="000000"/>
-              <w:right w:val="single" w:sz="6" w:space="0" w:color="000000"/>
-            </w:tcBorders>
-            <w:tcMar>
-              <w:top w:w="0" w:type="dxa"/>
-              <w:left w:w="0" w:type="dxa"/>
-              <w:bottom w:w="0" w:type="dxa"/>
-              <w:right w:w="0" w:type="dxa"/>
-            </w:tcMar>
+            <w:tcW w:w="3742" w:type="dxa"/>
             <w:vAlign w:val="center"/>
           </w:tcPr>
           <w:p>
             <w:pPr>
               <w:keepNext/>
-              <w:keepLines/>
-              <w:spacing w:after="0" w:line="240" w:lineRule="auto"/>
               <w:jc w:val="center"/>
               <w:rPr>
-                <w:rFonts w:ascii="Arial" w:eastAsia="Arial" w:hAnsi="Arial" w:cs="Arial"/>
-                <w:b/>
-                <w:bCs/>
-                <w:sz w:val="20"/>
-                <w:szCs w:val="20"/>
+                <w:rFonts w:ascii="Arial" w:eastAsia="Times New Roman" w:hAnsi="Arial" w:cs="Arial"/>
+                <w:b/>
+                <w:bCs/>
               </w:rPr>
             </w:pPr>
             <w:r>
               <w:rPr>
-                <w:rFonts w:ascii="Arial" w:eastAsia="Arial" w:hAnsi="Arial" w:cs="Arial"/>
-                <w:b/>
-                <w:bCs/>
-                <w:sz w:val="20"/>
-                <w:szCs w:val="20"/>
+                <w:rFonts w:ascii="Arial" w:eastAsia="Times New Roman" w:hAnsi="Arial" w:cs="Arial"/>
+                <w:b/>
+                <w:bCs/>
               </w:rPr>
               <w:t>Date Accomplished</w:t>
             </w:r>
@@ -737,42 +650,24 @@
         </w:tc>
         <w:tc>
           <w:tcPr>
-            <w:tcW w:w="2085" w:type="dxa"/>
-            <w:tcBorders>
-              <w:top w:val="single" w:sz="6" w:space="0" w:color="000000"/>
-              <w:left w:val="nil"/>
-              <w:bottom w:val="single" w:sz="6" w:space="0" w:color="000000"/>
-              <w:right w:val="single" w:sz="6" w:space="0" w:color="000000"/>
-            </w:tcBorders>
-            <w:tcMar>
-              <w:top w:w="0" w:type="dxa"/>
-              <w:left w:w="0" w:type="dxa"/>
-              <w:bottom w:w="0" w:type="dxa"/>
-              <w:right w:w="0" w:type="dxa"/>
-            </w:tcMar>
+            <w:tcW w:w="3742" w:type="dxa"/>
             <w:vAlign w:val="center"/>
           </w:tcPr>
           <w:p>
             <w:pPr>
               <w:keepNext/>
-              <w:keepLines/>
-              <w:spacing w:after="0" w:line="240" w:lineRule="auto"/>
               <w:jc w:val="center"/>
               <w:rPr>
-                <w:rFonts w:ascii="Arial" w:eastAsia="Arial" w:hAnsi="Arial" w:cs="Arial"/>
-                <w:b/>
-                <w:bCs/>
-                <w:sz w:val="20"/>
-                <w:szCs w:val="20"/>
+                <w:rFonts w:ascii="Arial" w:eastAsia="Times New Roman" w:hAnsi="Arial" w:cs="Arial"/>
+                <w:b/>
+                <w:bCs/>
               </w:rPr>
             </w:pPr>
             <w:r>
               <w:rPr>
-                <w:rFonts w:ascii="Arial" w:eastAsia="Arial" w:hAnsi="Arial" w:cs="Arial"/>
-                <w:b/>
-                <w:bCs/>
-                <w:sz w:val="20"/>
-                <w:szCs w:val="20"/>
+                <w:rFonts w:ascii="Arial" w:eastAsia="Times New Roman" w:hAnsi="Arial" w:cs="Arial"/>
+                <w:b/>
+                <w:bCs/>
               </w:rPr>
               <w:t>No. Of Days Transaction</w:t>
             </w:r>
@@ -784,6 +679,32 @@
       <w:pPr>
         <w:keepNext/>
         <w:spacing w:after="0" w:line="240" w:lineRule="auto"/>
+        <w:jc w:val="center"/>
+        <w:rPr>
+          <w:rFonts w:ascii="Times New Roman" w:eastAsia="Times New Roman" w:hAnsi="Times New Roman" w:cs="Times New Roman"/>
+          <w:b/>
+          <w:bCs/>
+        </w:rPr>
+      </w:pPr>
+    </w:p>
+    <w:p>
+      <w:pPr>
+        <w:keepNext/>
+        <w:spacing w:after="0" w:line="240" w:lineRule="auto"/>
+        <w:jc w:val="both"/>
+        <w:rPr>
+          <w:rFonts w:ascii="Arial" w:eastAsia="Arial" w:hAnsi="Arial" w:cs="Arial"/>
+          <w:b/>
+          <w:bCs/>
+          <w:sz w:val="22"/>
+          <w:szCs w:val="22"/>
+        </w:rPr>
+      </w:pPr>
+    </w:p>
+    <w:p>
+      <w:pPr>
+        <w:keepNext/>
+        <w:spacing w:after="0" w:line="240" w:lineRule="auto"/>
         <w:rPr>
           <w:rFonts w:ascii="Arial" w:eastAsia="Arial" w:hAnsi="Arial" w:cs="Arial"/>
           <w:sz w:val="20"/>
@@ -973,63 +894,35 @@
     </w:p>
     <w:tbl>
       <w:tblPr>
-        <w:tblStyle w:val="a"/>
-        <w:tblW w:w="18765" w:type="dxa"/>
-        <w:tblInd w:w="0" w:type="dxa"/>
-        <w:tblBorders>
-          <w:top w:val="nil"/>
-          <w:left w:val="nil"/>
-          <w:bottom w:val="nil"/>
-          <w:right w:val="nil"/>
-          <w:insideH w:val="nil"/>
-          <w:insideV w:val="nil"/>
-        </w:tblBorders>
-        <w:tblLayout w:type="fixed"/>
-        <w:tblLook w:val="0600" w:firstRow="0" w:lastRow="0" w:firstColumn="0" w:lastColumn="0" w:noHBand="1" w:noVBand="1"/>
+        <w:tblStyle w:val="TableGrid"/>
+        <w:tblW w:w="0" w:type="auto"/>
+        <w:tblLook w:val="04A0" w:firstRow="1" w:lastRow="0" w:firstColumn="1" w:lastColumn="0" w:noHBand="0" w:noVBand="1"/>
       </w:tblPr>
       <w:tblGrid>
-        <w:gridCol w:w="3345"/>
-        <w:gridCol w:w="5490"/>
-        <w:gridCol w:w="1995"/>
-        <w:gridCol w:w="1230"/>
-        <w:gridCol w:w="990"/>
-        <w:gridCol w:w="2085"/>
-        <w:gridCol w:w="1395"/>
-        <w:gridCol w:w="2235"/>
+        <w:gridCol w:w="2348"/>
+        <w:gridCol w:w="2340"/>
+        <w:gridCol w:w="2361"/>
+        <w:gridCol w:w="2387"/>
+        <w:gridCol w:w="2202"/>
+        <w:gridCol w:w="2490"/>
+        <w:gridCol w:w="2380"/>
+        <w:gridCol w:w="2202"/>
       </w:tblGrid>
       <w:tr>
-        <w:trPr>
-          <w:trHeight w:val="720"/>
-        </w:trPr>
         <w:tc>
           <w:tcPr>
-            <w:tcW w:w="3345" w:type="dxa"/>
-            <w:tcBorders>
-              <w:top w:val="single" w:sz="6" w:space="0" w:color="000000"/>
-              <w:left w:val="single" w:sz="6" w:space="0" w:color="000000"/>
-              <w:bottom w:val="single" w:sz="6" w:space="0" w:color="000000"/>
-              <w:right w:val="single" w:sz="6" w:space="0" w:color="000000"/>
-            </w:tcBorders>
-            <w:tcMar>
-              <w:top w:w="0" w:type="dxa"/>
-              <w:left w:w="0" w:type="dxa"/>
-              <w:bottom w:w="0" w:type="dxa"/>
-              <w:right w:w="0" w:type="dxa"/>
-            </w:tcMar>
+            <w:tcW w:w="2348" w:type="dxa"/>
             <w:vAlign w:val="center"/>
           </w:tcPr>
           <w:p>
             <w:pPr>
-              <w:keepNext/>
-              <w:keepLines/>
-              <w:spacing w:after="0" w:line="240" w:lineRule="auto"/>
               <w:jc w:val="center"/>
               <w:rPr>
                 <w:rFonts w:ascii="Arial" w:eastAsia="Arial" w:hAnsi="Arial" w:cs="Arial"/>
                 <w:b/>
                 <w:bCs/>
-                <w:sz w:val="20"/>
-                <w:szCs w:val="20"/>
+                <w:sz w:val="22"/>
+                <w:szCs w:val="22"/>
               </w:rPr>
             </w:pPr>
             <w:r>
@@ -1037,8 +930,8 @@
                 <w:rFonts w:ascii="Arial" w:eastAsia="Arial" w:hAnsi="Arial" w:cs="Arial"/>
                 <w:b/>
                 <w:bCs/>
-                <w:sz w:val="20"/>
-                <w:szCs w:val="20"/>
+                <w:sz w:val="22"/>
+                <w:szCs w:val="22"/>
               </w:rPr>
               <w:t>Type of Vehicle</w:t>
             </w:r>
@@ -1046,33 +939,18 @@
         </w:tc>
         <w:tc>
           <w:tcPr>
-            <w:tcW w:w="5490" w:type="dxa"/>
-            <w:tcBorders>
-              <w:top w:val="single" w:sz="6" w:space="0" w:color="000000"/>
-              <w:left w:val="nil"/>
-              <w:bottom w:val="single" w:sz="6" w:space="0" w:color="000000"/>
-              <w:right w:val="single" w:sz="6" w:space="0" w:color="000000"/>
-            </w:tcBorders>
-            <w:tcMar>
-              <w:top w:w="0" w:type="dxa"/>
-              <w:left w:w="0" w:type="dxa"/>
-              <w:bottom w:w="0" w:type="dxa"/>
-              <w:right w:w="0" w:type="dxa"/>
-            </w:tcMar>
+            <w:tcW w:w="2340" w:type="dxa"/>
             <w:vAlign w:val="center"/>
           </w:tcPr>
           <w:p>
             <w:pPr>
-              <w:keepNext/>
-              <w:keepLines/>
-              <w:spacing w:after="0" w:line="240" w:lineRule="auto"/>
               <w:jc w:val="center"/>
               <w:rPr>
                 <w:rFonts w:ascii="Arial" w:eastAsia="Arial" w:hAnsi="Arial" w:cs="Arial"/>
                 <w:b/>
                 <w:bCs/>
-                <w:sz w:val="20"/>
-                <w:szCs w:val="20"/>
+                <w:sz w:val="22"/>
+                <w:szCs w:val="22"/>
               </w:rPr>
             </w:pPr>
             <w:r>
@@ -1080,8 +958,8 @@
                 <w:rFonts w:ascii="Arial" w:eastAsia="Arial" w:hAnsi="Arial" w:cs="Arial"/>
                 <w:b/>
                 <w:bCs/>
-                <w:sz w:val="20"/>
-                <w:szCs w:val="20"/>
+                <w:sz w:val="22"/>
+                <w:szCs w:val="22"/>
               </w:rPr>
               <w:t>Details</w:t>
             </w:r>
@@ -1089,33 +967,18 @@
         </w:tc>
         <w:tc>
           <w:tcPr>
-            <w:tcW w:w="1995" w:type="dxa"/>
-            <w:tcBorders>
-              <w:top w:val="single" w:sz="6" w:space="0" w:color="000000"/>
-              <w:left w:val="nil"/>
-              <w:bottom w:val="single" w:sz="6" w:space="0" w:color="000000"/>
-              <w:right w:val="single" w:sz="6" w:space="0" w:color="000000"/>
-            </w:tcBorders>
-            <w:tcMar>
-              <w:top w:w="0" w:type="dxa"/>
-              <w:left w:w="0" w:type="dxa"/>
-              <w:bottom w:w="0" w:type="dxa"/>
-              <w:right w:w="0" w:type="dxa"/>
-            </w:tcMar>
+            <w:tcW w:w="2361" w:type="dxa"/>
             <w:vAlign w:val="center"/>
           </w:tcPr>
           <w:p>
             <w:pPr>
-              <w:keepNext/>
-              <w:keepLines/>
-              <w:spacing w:after="0" w:line="240" w:lineRule="auto"/>
               <w:jc w:val="center"/>
               <w:rPr>
                 <w:rFonts w:ascii="Arial" w:eastAsia="Arial" w:hAnsi="Arial" w:cs="Arial"/>
                 <w:b/>
                 <w:bCs/>
-                <w:sz w:val="20"/>
-                <w:szCs w:val="20"/>
+                <w:sz w:val="22"/>
+                <w:szCs w:val="22"/>
               </w:rPr>
             </w:pPr>
             <w:r>
@@ -1123,8 +986,8 @@
                 <w:rFonts w:ascii="Arial" w:eastAsia="Arial" w:hAnsi="Arial" w:cs="Arial"/>
                 <w:b/>
                 <w:bCs/>
-                <w:sz w:val="20"/>
-                <w:szCs w:val="20"/>
+                <w:sz w:val="22"/>
+                <w:szCs w:val="22"/>
               </w:rPr>
               <w:t>SI / OR Number</w:t>
             </w:r>
@@ -1132,33 +995,18 @@
         </w:tc>
         <w:tc>
           <w:tcPr>
-            <w:tcW w:w="1230" w:type="dxa"/>
-            <w:tcBorders>
-              <w:top w:val="single" w:sz="6" w:space="0" w:color="000000"/>
-              <w:left w:val="nil"/>
-              <w:bottom w:val="single" w:sz="6" w:space="0" w:color="000000"/>
-              <w:right w:val="single" w:sz="6" w:space="0" w:color="000000"/>
-            </w:tcBorders>
-            <w:tcMar>
-              <w:top w:w="0" w:type="dxa"/>
-              <w:left w:w="0" w:type="dxa"/>
-              <w:bottom w:w="0" w:type="dxa"/>
-              <w:right w:w="0" w:type="dxa"/>
-            </w:tcMar>
+            <w:tcW w:w="2387" w:type="dxa"/>
             <w:vAlign w:val="center"/>
           </w:tcPr>
           <w:p>
             <w:pPr>
-              <w:keepNext/>
-              <w:keepLines/>
-              <w:spacing w:after="0" w:line="240" w:lineRule="auto"/>
               <w:jc w:val="center"/>
               <w:rPr>
                 <w:rFonts w:ascii="Arial" w:eastAsia="Arial" w:hAnsi="Arial" w:cs="Arial"/>
                 <w:b/>
                 <w:bCs/>
-                <w:sz w:val="20"/>
-                <w:szCs w:val="20"/>
+                <w:sz w:val="22"/>
+                <w:szCs w:val="22"/>
               </w:rPr>
             </w:pPr>
             <w:r>
@@ -1166,8 +1014,8 @@
                 <w:rFonts w:ascii="Arial" w:eastAsia="Arial" w:hAnsi="Arial" w:cs="Arial"/>
                 <w:b/>
                 <w:bCs/>
-                <w:sz w:val="20"/>
-                <w:szCs w:val="20"/>
+                <w:sz w:val="22"/>
+                <w:szCs w:val="22"/>
               </w:rPr>
               <w:t>Date Item Procured</w:t>
             </w:r>
@@ -1175,66 +1023,36 @@
         </w:tc>
         <w:tc>
           <w:tcPr>
-            <w:tcW w:w="990" w:type="dxa"/>
-            <w:tcBorders>
-              <w:top w:val="single" w:sz="6" w:space="0" w:color="000000"/>
-              <w:left w:val="nil"/>
-              <w:bottom w:val="single" w:sz="6" w:space="0" w:color="000000"/>
-              <w:right w:val="single" w:sz="6" w:space="0" w:color="000000"/>
-            </w:tcBorders>
-            <w:tcMar>
-              <w:top w:w="0" w:type="dxa"/>
-              <w:left w:w="0" w:type="dxa"/>
-              <w:bottom w:w="0" w:type="dxa"/>
-              <w:right w:w="0" w:type="dxa"/>
-            </w:tcMar>
+            <w:tcW w:w="2202" w:type="dxa"/>
             <w:vAlign w:val="center"/>
           </w:tcPr>
           <w:p>
             <w:pPr>
-              <w:keepNext/>
-              <w:keepLines/>
-              <w:spacing w:after="0" w:line="240" w:lineRule="auto"/>
               <w:jc w:val="center"/>
               <w:rPr>
                 <w:rFonts w:ascii="Arial" w:eastAsia="Arial" w:hAnsi="Arial" w:cs="Arial"/>
                 <w:b/>
                 <w:bCs/>
-                <w:sz w:val="20"/>
-                <w:szCs w:val="20"/>
+                <w:sz w:val="22"/>
+                <w:szCs w:val="22"/>
               </w:rPr>
             </w:pPr>
           </w:p>
         </w:tc>
         <w:tc>
           <w:tcPr>
-            <w:tcW w:w="2085" w:type="dxa"/>
-            <w:tcBorders>
-              <w:top w:val="single" w:sz="6" w:space="0" w:color="000000"/>
-              <w:left w:val="nil"/>
-              <w:bottom w:val="single" w:sz="6" w:space="0" w:color="000000"/>
-              <w:right w:val="single" w:sz="6" w:space="0" w:color="000000"/>
-            </w:tcBorders>
-            <w:tcMar>
-              <w:top w:w="0" w:type="dxa"/>
-              <w:left w:w="0" w:type="dxa"/>
-              <w:bottom w:w="0" w:type="dxa"/>
-              <w:right w:w="0" w:type="dxa"/>
-            </w:tcMar>
+            <w:tcW w:w="2490" w:type="dxa"/>
             <w:vAlign w:val="center"/>
           </w:tcPr>
           <w:p>
             <w:pPr>
-              <w:keepNext/>
-              <w:keepLines/>
-              <w:spacing w:after="0" w:line="240" w:lineRule="auto"/>
               <w:jc w:val="center"/>
               <w:rPr>
                 <w:rFonts w:ascii="Arial" w:eastAsia="Arial" w:hAnsi="Arial" w:cs="Arial"/>
                 <w:b/>
                 <w:bCs/>
-                <w:sz w:val="20"/>
-                <w:szCs w:val="20"/>
+                <w:sz w:val="22"/>
+                <w:szCs w:val="22"/>
               </w:rPr>
             </w:pPr>
             <w:r>
@@ -1242,8 +1060,8 @@
                 <w:rFonts w:ascii="Arial" w:eastAsia="Arial" w:hAnsi="Arial" w:cs="Arial"/>
                 <w:b/>
                 <w:bCs/>
-                <w:sz w:val="20"/>
-                <w:szCs w:val="20"/>
+                <w:sz w:val="22"/>
+                <w:szCs w:val="22"/>
               </w:rPr>
               <w:t>Date Task Accomplished</w:t>
             </w:r>
@@ -1251,33 +1069,18 @@
         </w:tc>
         <w:tc>
           <w:tcPr>
-            <w:tcW w:w="1395" w:type="dxa"/>
-            <w:tcBorders>
-              <w:top w:val="single" w:sz="6" w:space="0" w:color="000000"/>
-              <w:left w:val="nil"/>
-              <w:bottom w:val="single" w:sz="6" w:space="0" w:color="000000"/>
-              <w:right w:val="single" w:sz="6" w:space="0" w:color="000000"/>
-            </w:tcBorders>
-            <w:tcMar>
-              <w:top w:w="0" w:type="dxa"/>
-              <w:left w:w="0" w:type="dxa"/>
-              <w:bottom w:w="0" w:type="dxa"/>
-              <w:right w:w="0" w:type="dxa"/>
-            </w:tcMar>
+            <w:tcW w:w="2380" w:type="dxa"/>
             <w:vAlign w:val="center"/>
           </w:tcPr>
           <w:p>
             <w:pPr>
-              <w:keepNext/>
-              <w:keepLines/>
-              <w:spacing w:after="0" w:line="240" w:lineRule="auto"/>
               <w:jc w:val="center"/>
               <w:rPr>
                 <w:rFonts w:ascii="Arial" w:eastAsia="Arial" w:hAnsi="Arial" w:cs="Arial"/>
                 <w:b/>
                 <w:bCs/>
-                <w:sz w:val="20"/>
-                <w:szCs w:val="20"/>
+                <w:sz w:val="22"/>
+                <w:szCs w:val="22"/>
               </w:rPr>
             </w:pPr>
             <w:r>
@@ -1285,8 +1088,8 @@
                 <w:rFonts w:ascii="Arial" w:eastAsia="Arial" w:hAnsi="Arial" w:cs="Arial"/>
                 <w:b/>
                 <w:bCs/>
-                <w:sz w:val="20"/>
-                <w:szCs w:val="20"/>
+                <w:sz w:val="22"/>
+                <w:szCs w:val="22"/>
               </w:rPr>
               <w:t>Remarks</w:t>
             </w:r>
@@ -1294,33 +1097,18 @@
         </w:tc>
         <w:tc>
           <w:tcPr>
-            <w:tcW w:w="2235" w:type="dxa"/>
-            <w:tcBorders>
-              <w:top w:val="single" w:sz="6" w:space="0" w:color="000000"/>
-              <w:left w:val="nil"/>
-              <w:bottom w:val="single" w:sz="6" w:space="0" w:color="000000"/>
-              <w:right w:val="single" w:sz="6" w:space="0" w:color="000000"/>
-            </w:tcBorders>
-            <w:tcMar>
-              <w:top w:w="0" w:type="dxa"/>
-              <w:left w:w="0" w:type="dxa"/>
-              <w:bottom w:w="0" w:type="dxa"/>
-              <w:right w:w="0" w:type="dxa"/>
-            </w:tcMar>
+            <w:tcW w:w="2202" w:type="dxa"/>
             <w:vAlign w:val="center"/>
           </w:tcPr>
           <w:p>
             <w:pPr>
-              <w:keepNext/>
-              <w:keepLines/>
-              <w:spacing w:after="0" w:line="240" w:lineRule="auto"/>
               <w:jc w:val="center"/>
               <w:rPr>
                 <w:rFonts w:ascii="Arial" w:eastAsia="Arial" w:hAnsi="Arial" w:cs="Arial"/>
                 <w:b/>
                 <w:bCs/>
-                <w:sz w:val="20"/>
-                <w:szCs w:val="20"/>
+                <w:sz w:val="22"/>
+                <w:szCs w:val="22"/>
               </w:rPr>
             </w:pPr>
             <w:r>
@@ -1328,8 +1116,8 @@
                 <w:rFonts w:ascii="Arial" w:eastAsia="Arial" w:hAnsi="Arial" w:cs="Arial"/>
                 <w:b/>
                 <w:bCs/>
-                <w:sz w:val="20"/>
-                <w:szCs w:val="20"/>
+                <w:sz w:val="22"/>
+                <w:szCs w:val="22"/>
               </w:rPr>
               <w:t>No. Of Days Transaction</w:t>
             </w:r>
@@ -1337,6 +1125,18 @@
         </w:tc>
       </w:tr>
     </w:tbl>
+    <w:p>
+      <w:pPr>
+        <w:jc w:val="center"/>
+        <w:rPr>
+          <w:rFonts w:ascii="Arial" w:eastAsia="Arial" w:hAnsi="Arial" w:cs="Arial"/>
+          <w:b/>
+          <w:bCs/>
+          <w:sz w:val="22"/>
+          <w:szCs w:val="22"/>
+        </w:rPr>
+      </w:pPr>
+    </w:p>
     <w:p>
       <w:pPr>
         <w:jc w:val="both"/>
@@ -1907,6 +1707,7 @@
   <w:style w:type="character" w:default="1" w:styleId="DefaultParagraphFont">
     <w:name w:val="Default Paragraph Font"/>
     <w:uiPriority w:val="1"/>
+    <w:semiHidden/>
     <w:unhideWhenUsed/>
   </w:style>
   <w:style w:type="table" w:default="1" w:styleId="TableNormal">

</xml_diff>